<commit_message>
Deploying to gh-pages from @ nlmixr2/nonmem2rx@0999f2c623540f03ebab2bb88e473b7078e870d9 🚀
</commit_message>
<xml_diff>
--- a/articles/mod-Word.docx
+++ b/articles/mod-Word.docx
@@ -2343,7 +2343,7 @@
         </w:rPr>
         <w:t xml:space="preserve">Table </w:t>
       </w:r>
-      <w:bookmarkStart w:id="f73030c5-3bfc-4555-b1a4-52cf38206d20" w:name="pest_table"/>
+      <w:bookmarkStart w:id="e74bf110-d414-48a5-b6ae-63e0cc221314" w:name="pest_table"/>
       <w:r>
         <w:rPr/>
         <w:t xml:space="preserve"/>
@@ -2364,7 +2364,7 @@
         <w:rPr/>
         <w:t xml:space="preserve"/>
       </w:r>
-      <w:bookmarkEnd w:id="f73030c5-3bfc-4555-b1a4-52cf38206d20"/>
+      <w:bookmarkEnd w:id="e74bf110-d414-48a5-b6ae-63e0cc221314"/>
       <w:r>
         <w:rPr>
           <w:rFonts/>
@@ -2435,7 +2435,7 @@
                   <pic:spPr bwMode="auto">
                     <a:xfrm>
                       <a:off x="0" y="0"/>
-                      <a:ext cx="101600" cy="53340"/>
+                      <a:ext cx="7315200" cy="3840480"/>
                     </a:xfrm>
                     <a:prstGeom prst="rect">
                       <a:avLst/>
@@ -2460,7 +2460,7 @@
         </w:rPr>
         <w:t xml:space="preserve">Figure </w:t>
       </w:r>
-      <w:bookmarkStart w:id="f5d947c0-c62a-41c2-958b-7f13b4722c5a" w:name="ind_plots"/>
+      <w:bookmarkStart w:id="d844d635-ffef-486e-bc3c-05913ad512a0" w:name="ind_plots"/>
       <w:r>
         <w:rPr/>
         <w:t xml:space="preserve"/>
@@ -2481,7 +2481,7 @@
         <w:rPr/>
         <w:t xml:space="preserve"/>
       </w:r>
-      <w:bookmarkEnd w:id="f5d947c0-c62a-41c2-958b-7f13b4722c5a"/>
+      <w:bookmarkEnd w:id="d844d635-ffef-486e-bc3c-05913ad512a0"/>
       <w:r>
         <w:rPr>
           <w:rFonts/>
@@ -2534,7 +2534,7 @@
                   <pic:spPr bwMode="auto">
                     <a:xfrm>
                       <a:off x="0" y="0"/>
-                      <a:ext cx="101600" cy="53340"/>
+                      <a:ext cx="7315200" cy="3840480"/>
                     </a:xfrm>
                     <a:prstGeom prst="rect">
                       <a:avLst/>
@@ -2623,7 +2623,7 @@
                   <pic:spPr bwMode="auto">
                     <a:xfrm>
                       <a:off x="0" y="0"/>
-                      <a:ext cx="101600" cy="53340"/>
+                      <a:ext cx="7315200" cy="3840480"/>
                     </a:xfrm>
                     <a:prstGeom prst="rect">
                       <a:avLst/>
@@ -2712,7 +2712,7 @@
                   <pic:spPr bwMode="auto">
                     <a:xfrm>
                       <a:off x="0" y="0"/>
-                      <a:ext cx="101600" cy="53340"/>
+                      <a:ext cx="7315200" cy="3840480"/>
                     </a:xfrm>
                     <a:prstGeom prst="rect">
                       <a:avLst/>
@@ -2801,7 +2801,7 @@
                   <pic:spPr bwMode="auto">
                     <a:xfrm>
                       <a:off x="0" y="0"/>
-                      <a:ext cx="101600" cy="53340"/>
+                      <a:ext cx="7315200" cy="3840480"/>
                     </a:xfrm>
                     <a:prstGeom prst="rect">
                       <a:avLst/>
@@ -2890,7 +2890,7 @@
                   <pic:spPr bwMode="auto">
                     <a:xfrm>
                       <a:off x="0" y="0"/>
-                      <a:ext cx="101600" cy="53340"/>
+                      <a:ext cx="7315200" cy="3840480"/>
                     </a:xfrm>
                     <a:prstGeom prst="rect">
                       <a:avLst/>
@@ -2979,7 +2979,7 @@
                   <pic:spPr bwMode="auto">
                     <a:xfrm>
                       <a:off x="0" y="0"/>
-                      <a:ext cx="101600" cy="53340"/>
+                      <a:ext cx="7315200" cy="3840480"/>
                     </a:xfrm>
                     <a:prstGeom prst="rect">
                       <a:avLst/>
@@ -3068,7 +3068,7 @@
                   <pic:spPr bwMode="auto">
                     <a:xfrm>
                       <a:off x="0" y="0"/>
-                      <a:ext cx="101600" cy="53340"/>
+                      <a:ext cx="7315200" cy="3840480"/>
                     </a:xfrm>
                     <a:prstGeom prst="rect">
                       <a:avLst/>
@@ -3157,7 +3157,7 @@
                   <pic:spPr bwMode="auto">
                     <a:xfrm>
                       <a:off x="0" y="0"/>
-                      <a:ext cx="101600" cy="53340"/>
+                      <a:ext cx="7315200" cy="3840480"/>
                     </a:xfrm>
                     <a:prstGeom prst="rect">
                       <a:avLst/>
@@ -3246,7 +3246,7 @@
                   <pic:spPr bwMode="auto">
                     <a:xfrm>
                       <a:off x="0" y="0"/>
-                      <a:ext cx="101600" cy="53340"/>
+                      <a:ext cx="7315200" cy="3840480"/>
                     </a:xfrm>
                     <a:prstGeom prst="rect">
                       <a:avLst/>
@@ -3339,7 +3339,7 @@
                   <pic:spPr bwMode="auto">
                     <a:xfrm>
                       <a:off x="0" y="0"/>
-                      <a:ext cx="82550" cy="76200"/>
+                      <a:ext cx="5943600" cy="5486400"/>
                     </a:xfrm>
                     <a:prstGeom prst="rect">
                       <a:avLst/>
@@ -3364,7 +3364,7 @@
         </w:rPr>
         <w:t xml:space="preserve">Figure </w:t>
       </w:r>
-      <w:bookmarkStart w:id="aa677319-67ac-42be-ac1a-4e1850d89396" w:name="dv_vs_pred_ipred"/>
+      <w:bookmarkStart w:id="ebd605f3-1fe2-414e-ad1e-252d51ecb4d2" w:name="dv_vs_pred_ipred"/>
       <w:r>
         <w:rPr/>
         <w:t xml:space="preserve"/>
@@ -3385,7 +3385,7 @@
         <w:rPr/>
         <w:t xml:space="preserve"/>
       </w:r>
-      <w:bookmarkEnd w:id="aa677319-67ac-42be-ac1a-4e1850d89396"/>
+      <w:bookmarkEnd w:id="ebd605f3-1fe2-414e-ad1e-252d51ecb4d2"/>
       <w:r>
         <w:rPr>
           <w:rFonts/>
@@ -3448,7 +3448,7 @@
                   <pic:spPr bwMode="auto">
                     <a:xfrm>
                       <a:off x="0" y="0"/>
-                      <a:ext cx="101600" cy="53340"/>
+                      <a:ext cx="7315200" cy="3840480"/>
                     </a:xfrm>
                     <a:prstGeom prst="rect">
                       <a:avLst/>
@@ -3473,7 +3473,7 @@
         </w:rPr>
         <w:t xml:space="preserve">Figure </w:t>
       </w:r>
-      <w:bookmarkStart w:id="9a590bf0-1b40-4bf0-aaac-4e248c86e96f" w:name="prm_vs_iteration"/>
+      <w:bookmarkStart w:id="9f97e778-403d-4788-92c6-dcb8585c25a0" w:name="prm_vs_iteration"/>
       <w:r>
         <w:rPr/>
         <w:t xml:space="preserve"/>
@@ -3494,7 +3494,7 @@
         <w:rPr/>
         <w:t xml:space="preserve"/>
       </w:r>
-      <w:bookmarkEnd w:id="9a590bf0-1b40-4bf0-aaac-4e248c86e96f"/>
+      <w:bookmarkEnd w:id="9f97e778-403d-4788-92c6-dcb8585c25a0"/>
       <w:r>
         <w:rPr>
           <w:rFonts/>

</xml_diff>

<commit_message>
Deploying to gh-pages from @ nlmixr2/nonmem2rx@69fcc2d6d9645c57c4f8ddbb04f798806c3ff19f 🚀
</commit_message>
<xml_diff>
--- a/articles/mod-Word.docx
+++ b/articles/mod-Word.docx
@@ -31,7 +31,6 @@
           <w:trHeight w:val="607" w:hRule="auto"/>
           <w:tblHeader/>
         </w:trPr>
-        header1
         <w:tc>
           <w:tcPr>
             <w:tcBorders>
@@ -51,6 +50,7 @@
           </w:tcPr>
           <w:p>
             <w:pPr>
+              <w:pStyle w:val="Normal"/>
               <w:jc w:val="left"/>
               <w:pBdr>
                 <w:bottom w:val="none" w:sz="0" w:space="0" w:color="000000"/>
@@ -105,6 +105,7 @@
           </w:tcPr>
           <w:p>
             <w:pPr>
+              <w:pStyle w:val="Normal"/>
               <w:jc w:val="left"/>
               <w:pBdr>
                 <w:bottom w:val="none" w:sz="0" w:space="0" w:color="000000"/>
@@ -159,6 +160,7 @@
           </w:tcPr>
           <w:p>
             <w:pPr>
+              <w:pStyle w:val="Normal"/>
               <w:jc w:val="left"/>
               <w:pBdr>
                 <w:bottom w:val="none" w:sz="0" w:space="0" w:color="000000"/>
@@ -213,6 +215,7 @@
           </w:tcPr>
           <w:p>
             <w:pPr>
+              <w:pStyle w:val="Normal"/>
               <w:jc w:val="left"/>
               <w:pBdr>
                 <w:bottom w:val="none" w:sz="0" w:space="0" w:color="000000"/>
@@ -267,6 +270,7 @@
           </w:tcPr>
           <w:p>
             <w:pPr>
+              <w:pStyle w:val="Normal"/>
               <w:jc w:val="left"/>
               <w:pBdr>
                 <w:bottom w:val="none" w:sz="0" w:space="0" w:color="000000"/>
@@ -321,6 +325,7 @@
           </w:tcPr>
           <w:p>
             <w:pPr>
+              <w:pStyle w:val="Normal"/>
               <w:jc w:val="left"/>
               <w:pBdr>
                 <w:bottom w:val="none" w:sz="0" w:space="0" w:color="000000"/>
@@ -375,6 +380,7 @@
           </w:tcPr>
           <w:p>
             <w:pPr>
+              <w:pStyle w:val="Normal"/>
               <w:jc w:val="left"/>
               <w:pBdr>
                 <w:bottom w:val="none" w:sz="0" w:space="0" w:color="000000"/>
@@ -415,7 +421,6 @@
         <w:trPr>
           <w:trHeight w:val="641" w:hRule="auto"/>
         </w:trPr>
-        body1
         <w:tc>
           <w:tcPr>
             <w:tcBorders>
@@ -435,6 +440,7 @@
           </w:tcPr>
           <w:p>
             <w:pPr>
+              <w:pStyle w:val="Normal"/>
               <w:jc w:val="left"/>
               <w:pBdr>
                 <w:bottom w:val="none" w:sz="0" w:space="0" w:color="000000"/>
@@ -489,6 +495,7 @@
           </w:tcPr>
           <w:p>
             <w:pPr>
+              <w:pStyle w:val="Normal"/>
               <w:jc w:val="left"/>
               <w:pBdr>
                 <w:bottom w:val="none" w:sz="0" w:space="0" w:color="000000"/>
@@ -543,6 +550,7 @@
           </w:tcPr>
           <w:p>
             <w:pPr>
+              <w:pStyle w:val="Normal"/>
               <w:jc w:val="left"/>
               <w:pBdr>
                 <w:bottom w:val="none" w:sz="0" w:space="0" w:color="000000"/>
@@ -597,6 +605,7 @@
           </w:tcPr>
           <w:p>
             <w:pPr>
+              <w:pStyle w:val="Normal"/>
               <w:jc w:val="left"/>
               <w:pBdr>
                 <w:bottom w:val="none" w:sz="0" w:space="0" w:color="000000"/>
@@ -651,6 +660,7 @@
           </w:tcPr>
           <w:p>
             <w:pPr>
+              <w:pStyle w:val="Normal"/>
               <w:jc w:val="left"/>
               <w:pBdr>
                 <w:bottom w:val="none" w:sz="0" w:space="0" w:color="000000"/>
@@ -705,6 +715,7 @@
           </w:tcPr>
           <w:p>
             <w:pPr>
+              <w:pStyle w:val="Normal"/>
               <w:jc w:val="left"/>
               <w:pBdr>
                 <w:bottom w:val="none" w:sz="0" w:space="0" w:color="000000"/>
@@ -759,6 +770,7 @@
           </w:tcPr>
           <w:p>
             <w:pPr>
+              <w:pStyle w:val="Normal"/>
               <w:jc w:val="left"/>
               <w:pBdr>
                 <w:bottom w:val="none" w:sz="0" w:space="0" w:color="000000"/>
@@ -799,7 +811,6 @@
         <w:trPr>
           <w:trHeight w:val="638" w:hRule="auto"/>
         </w:trPr>
-        body2
         <w:tc>
           <w:tcPr>
             <w:tcBorders>
@@ -819,6 +830,7 @@
           </w:tcPr>
           <w:p>
             <w:pPr>
+              <w:pStyle w:val="Normal"/>
               <w:jc w:val="left"/>
               <w:pBdr>
                 <w:bottom w:val="none" w:sz="0" w:space="0" w:color="000000"/>
@@ -873,6 +885,7 @@
           </w:tcPr>
           <w:p>
             <w:pPr>
+              <w:pStyle w:val="Normal"/>
               <w:jc w:val="left"/>
               <w:pBdr>
                 <w:bottom w:val="none" w:sz="0" w:space="0" w:color="000000"/>
@@ -927,6 +940,7 @@
           </w:tcPr>
           <w:p>
             <w:pPr>
+              <w:pStyle w:val="Normal"/>
               <w:jc w:val="left"/>
               <w:pBdr>
                 <w:bottom w:val="none" w:sz="0" w:space="0" w:color="000000"/>
@@ -981,6 +995,7 @@
           </w:tcPr>
           <w:p>
             <w:pPr>
+              <w:pStyle w:val="Normal"/>
               <w:jc w:val="left"/>
               <w:pBdr>
                 <w:bottom w:val="none" w:sz="0" w:space="0" w:color="000000"/>
@@ -1035,6 +1050,7 @@
           </w:tcPr>
           <w:p>
             <w:pPr>
+              <w:pStyle w:val="Normal"/>
               <w:jc w:val="left"/>
               <w:pBdr>
                 <w:bottom w:val="none" w:sz="0" w:space="0" w:color="000000"/>
@@ -1089,6 +1105,7 @@
           </w:tcPr>
           <w:p>
             <w:pPr>
+              <w:pStyle w:val="Normal"/>
               <w:jc w:val="left"/>
               <w:pBdr>
                 <w:bottom w:val="none" w:sz="0" w:space="0" w:color="000000"/>
@@ -1143,6 +1160,7 @@
           </w:tcPr>
           <w:p>
             <w:pPr>
+              <w:pStyle w:val="Normal"/>
               <w:jc w:val="left"/>
               <w:pBdr>
                 <w:bottom w:val="none" w:sz="0" w:space="0" w:color="000000"/>
@@ -1183,7 +1201,6 @@
         <w:trPr>
           <w:trHeight w:val="641" w:hRule="auto"/>
         </w:trPr>
-        body3
         <w:tc>
           <w:tcPr>
             <w:tcBorders>
@@ -1203,6 +1220,7 @@
           </w:tcPr>
           <w:p>
             <w:pPr>
+              <w:pStyle w:val="Normal"/>
               <w:jc w:val="left"/>
               <w:pBdr>
                 <w:bottom w:val="none" w:sz="0" w:space="0" w:color="000000"/>
@@ -1257,6 +1275,7 @@
           </w:tcPr>
           <w:p>
             <w:pPr>
+              <w:pStyle w:val="Normal"/>
               <w:jc w:val="left"/>
               <w:pBdr>
                 <w:bottom w:val="none" w:sz="0" w:space="0" w:color="000000"/>
@@ -1311,6 +1330,7 @@
           </w:tcPr>
           <w:p>
             <w:pPr>
+              <w:pStyle w:val="Normal"/>
               <w:jc w:val="left"/>
               <w:pBdr>
                 <w:bottom w:val="none" w:sz="0" w:space="0" w:color="000000"/>
@@ -1365,6 +1385,7 @@
           </w:tcPr>
           <w:p>
             <w:pPr>
+              <w:pStyle w:val="Normal"/>
               <w:jc w:val="left"/>
               <w:pBdr>
                 <w:bottom w:val="none" w:sz="0" w:space="0" w:color="000000"/>
@@ -1419,6 +1440,7 @@
           </w:tcPr>
           <w:p>
             <w:pPr>
+              <w:pStyle w:val="Normal"/>
               <w:jc w:val="left"/>
               <w:pBdr>
                 <w:bottom w:val="none" w:sz="0" w:space="0" w:color="000000"/>
@@ -1473,6 +1495,7 @@
           </w:tcPr>
           <w:p>
             <w:pPr>
+              <w:pStyle w:val="Normal"/>
               <w:jc w:val="left"/>
               <w:pBdr>
                 <w:bottom w:val="none" w:sz="0" w:space="0" w:color="000000"/>
@@ -1527,6 +1550,7 @@
           </w:tcPr>
           <w:p>
             <w:pPr>
+              <w:pStyle w:val="Normal"/>
               <w:jc w:val="left"/>
               <w:pBdr>
                 <w:bottom w:val="none" w:sz="0" w:space="0" w:color="000000"/>
@@ -1567,7 +1591,6 @@
         <w:trPr>
           <w:trHeight w:val="638" w:hRule="auto"/>
         </w:trPr>
-        body4
         <w:tc>
           <w:tcPr>
             <w:tcBorders>
@@ -1587,6 +1610,7 @@
           </w:tcPr>
           <w:p>
             <w:pPr>
+              <w:pStyle w:val="Normal"/>
               <w:jc w:val="left"/>
               <w:pBdr>
                 <w:bottom w:val="none" w:sz="0" w:space="0" w:color="000000"/>
@@ -1641,6 +1665,7 @@
           </w:tcPr>
           <w:p>
             <w:pPr>
+              <w:pStyle w:val="Normal"/>
               <w:jc w:val="left"/>
               <w:pBdr>
                 <w:bottom w:val="none" w:sz="0" w:space="0" w:color="000000"/>
@@ -1695,6 +1720,7 @@
           </w:tcPr>
           <w:p>
             <w:pPr>
+              <w:pStyle w:val="Normal"/>
               <w:jc w:val="left"/>
               <w:pBdr>
                 <w:bottom w:val="none" w:sz="0" w:space="0" w:color="000000"/>
@@ -1749,6 +1775,7 @@
           </w:tcPr>
           <w:p>
             <w:pPr>
+              <w:pStyle w:val="Normal"/>
               <w:jc w:val="left"/>
               <w:pBdr>
                 <w:bottom w:val="none" w:sz="0" w:space="0" w:color="000000"/>
@@ -1803,6 +1830,7 @@
           </w:tcPr>
           <w:p>
             <w:pPr>
+              <w:pStyle w:val="Normal"/>
               <w:jc w:val="left"/>
               <w:pBdr>
                 <w:bottom w:val="none" w:sz="0" w:space="0" w:color="000000"/>
@@ -1857,6 +1885,7 @@
           </w:tcPr>
           <w:p>
             <w:pPr>
+              <w:pStyle w:val="Normal"/>
               <w:jc w:val="left"/>
               <w:pBdr>
                 <w:bottom w:val="none" w:sz="0" w:space="0" w:color="000000"/>
@@ -1911,6 +1940,7 @@
           </w:tcPr>
           <w:p>
             <w:pPr>
+              <w:pStyle w:val="Normal"/>
               <w:jc w:val="left"/>
               <w:pBdr>
                 <w:bottom w:val="none" w:sz="0" w:space="0" w:color="000000"/>
@@ -1951,7 +1981,6 @@
         <w:trPr>
           <w:trHeight w:val="594" w:hRule="auto"/>
         </w:trPr>
-        body5
         <w:tc>
           <w:tcPr>
             <w:tcBorders>
@@ -1971,6 +2000,7 @@
           </w:tcPr>
           <w:p>
             <w:pPr>
+              <w:pStyle w:val="Normal"/>
               <w:jc w:val="left"/>
               <w:pBdr>
                 <w:bottom w:val="none" w:sz="0" w:space="0" w:color="000000"/>
@@ -2025,6 +2055,7 @@
           </w:tcPr>
           <w:p>
             <w:pPr>
+              <w:pStyle w:val="Normal"/>
               <w:jc w:val="left"/>
               <w:pBdr>
                 <w:bottom w:val="none" w:sz="0" w:space="0" w:color="000000"/>
@@ -2079,6 +2110,7 @@
           </w:tcPr>
           <w:p>
             <w:pPr>
+              <w:pStyle w:val="Normal"/>
               <w:jc w:val="left"/>
               <w:pBdr>
                 <w:bottom w:val="none" w:sz="0" w:space="0" w:color="000000"/>
@@ -2133,6 +2165,7 @@
           </w:tcPr>
           <w:p>
             <w:pPr>
+              <w:pStyle w:val="Normal"/>
               <w:jc w:val="left"/>
               <w:pBdr>
                 <w:bottom w:val="none" w:sz="0" w:space="0" w:color="000000"/>
@@ -2187,6 +2220,7 @@
           </w:tcPr>
           <w:p>
             <w:pPr>
+              <w:pStyle w:val="Normal"/>
               <w:jc w:val="left"/>
               <w:pBdr>
                 <w:bottom w:val="none" w:sz="0" w:space="0" w:color="000000"/>
@@ -2241,6 +2275,7 @@
           </w:tcPr>
           <w:p>
             <w:pPr>
+              <w:pStyle w:val="Normal"/>
               <w:jc w:val="left"/>
               <w:pBdr>
                 <w:bottom w:val="none" w:sz="0" w:space="0" w:color="000000"/>
@@ -2295,6 +2330,7 @@
           </w:tcPr>
           <w:p>
             <w:pPr>
+              <w:pStyle w:val="Normal"/>
               <w:jc w:val="left"/>
               <w:pBdr>
                 <w:bottom w:val="none" w:sz="0" w:space="0" w:color="000000"/>
@@ -2343,7 +2379,7 @@
         </w:rPr>
         <w:t xml:space="preserve">Table </w:t>
       </w:r>
-      <w:bookmarkStart w:id="e74bf110-d414-48a5-b6ae-63e0cc221314" w:name="pest_table"/>
+      <w:bookmarkStart w:id="7de23032-08e1-4832-a4e4-ad8d1dbb174c" w:name="pest_table"/>
       <w:r>
         <w:rPr/>
         <w:t xml:space="preserve"/>
@@ -2364,7 +2400,7 @@
         <w:rPr/>
         <w:t xml:space="preserve"/>
       </w:r>
-      <w:bookmarkEnd w:id="e74bf110-d414-48a5-b6ae-63e0cc221314"/>
+      <w:bookmarkEnd w:id="7de23032-08e1-4832-a4e4-ad8d1dbb174c"/>
       <w:r>
         <w:rPr>
           <w:rFonts/>
@@ -2460,7 +2496,7 @@
         </w:rPr>
         <w:t xml:space="preserve">Figure </w:t>
       </w:r>
-      <w:bookmarkStart w:id="d844d635-ffef-486e-bc3c-05913ad512a0" w:name="ind_plots"/>
+      <w:bookmarkStart w:id="b5d12d51-1de8-4958-9ab2-e29e29b0ec77" w:name="ind_plots"/>
       <w:r>
         <w:rPr/>
         <w:t xml:space="preserve"/>
@@ -2481,7 +2517,7 @@
         <w:rPr/>
         <w:t xml:space="preserve"/>
       </w:r>
-      <w:bookmarkEnd w:id="d844d635-ffef-486e-bc3c-05913ad512a0"/>
+      <w:bookmarkEnd w:id="b5d12d51-1de8-4958-9ab2-e29e29b0ec77"/>
       <w:r>
         <w:rPr>
           <w:rFonts/>
@@ -3364,7 +3400,7 @@
         </w:rPr>
         <w:t xml:space="preserve">Figure </w:t>
       </w:r>
-      <w:bookmarkStart w:id="ebd605f3-1fe2-414e-ad1e-252d51ecb4d2" w:name="dv_vs_pred_ipred"/>
+      <w:bookmarkStart w:id="dcd23533-c326-4b51-a24f-25c756e1cbb1" w:name="dv_vs_pred_ipred"/>
       <w:r>
         <w:rPr/>
         <w:t xml:space="preserve"/>
@@ -3385,7 +3421,7 @@
         <w:rPr/>
         <w:t xml:space="preserve"/>
       </w:r>
-      <w:bookmarkEnd w:id="ebd605f3-1fe2-414e-ad1e-252d51ecb4d2"/>
+      <w:bookmarkEnd w:id="dcd23533-c326-4b51-a24f-25c756e1cbb1"/>
       <w:r>
         <w:rPr>
           <w:rFonts/>
@@ -3473,7 +3509,7 @@
         </w:rPr>
         <w:t xml:space="preserve">Figure </w:t>
       </w:r>
-      <w:bookmarkStart w:id="9f97e778-403d-4788-92c6-dcb8585c25a0" w:name="prm_vs_iteration"/>
+      <w:bookmarkStart w:id="11c7d196-68d4-436b-93de-4541094f694e" w:name="prm_vs_iteration"/>
       <w:r>
         <w:rPr/>
         <w:t xml:space="preserve"/>
@@ -3494,7 +3530,7 @@
         <w:rPr/>
         <w:t xml:space="preserve"/>
       </w:r>
-      <w:bookmarkEnd w:id="9f97e778-403d-4788-92c6-dcb8585c25a0"/>
+      <w:bookmarkEnd w:id="11c7d196-68d4-436b-93de-4541094f694e"/>
       <w:r>
         <w:rPr>
           <w:rFonts/>

</xml_diff>

<commit_message>
Deploying to gh-pages from @ nlmixr2/nonmem2rx@728d75c7c5a250a0626055c8fb988e1e8603b8b7 🚀
</commit_message>
<xml_diff>
--- a/articles/mod-Word.docx
+++ b/articles/mod-Word.docx
@@ -19,16 +19,16 @@
       </w:tblPr>
       <w:tblGrid>
         <w:gridCol w:w="1565"/>
-        <w:gridCol w:w="1040"/>
         <w:gridCol w:w="1180"/>
-        <w:gridCol w:w="1051"/>
+        <w:gridCol w:w="1460"/>
+        <w:gridCol w:w="1180"/>
         <w:gridCol w:w="3261"/>
         <w:gridCol w:w="1537"/>
         <w:gridCol w:w="1798"/>
       </w:tblGrid>
       <w:tr>
         <w:trPr>
-          <w:trHeight w:val="607" w:hRule="auto"/>
+          <w:trHeight w:val="638" w:hRule="auto"/>
           <w:tblHeader/>
         </w:trPr>
         <w:tc>
@@ -419,7 +419,7 @@
       </w:tr>
       <w:tr>
         <w:trPr>
-          <w:trHeight w:val="641" w:hRule="auto"/>
+          <w:trHeight w:val="632" w:hRule="auto"/>
         </w:trPr>
         <w:tc>
           <w:tcPr>
@@ -527,7 +527,7 @@
                 <w:szCs w:val="22"/>
                 <w:color w:val="000000"/>
               </w:rPr>
-              <w:t xml:space="preserve">1.37</w:t>
+              <w:t xml:space="preserve">1.370</w:t>
             </w:r>
           </w:p>
         </w:tc>
@@ -582,7 +582,7 @@
                 <w:szCs w:val="22"/>
                 <w:color w:val="000000"/>
               </w:rPr>
-              <w:t xml:space="preserve">0.0298</w:t>
+              <w:t xml:space="preserve">0.02979</w:t>
             </w:r>
           </w:p>
         </w:tc>
@@ -637,7 +637,7 @@
                 <w:szCs w:val="22"/>
                 <w:color w:val="000000"/>
               </w:rPr>
-              <w:t xml:space="preserve">2.17</w:t>
+              <w:t xml:space="preserve">2.174</w:t>
             </w:r>
           </w:p>
         </w:tc>
@@ -692,7 +692,7 @@
                 <w:szCs w:val="22"/>
                 <w:color w:val="000000"/>
               </w:rPr>
-              <w:t xml:space="preserve">3.94 (3.71, 4.17)</w:t>
+              <w:t xml:space="preserve">3.937 (3.713, 4.173)</w:t>
             </w:r>
           </w:p>
         </w:tc>
@@ -747,7 +747,7 @@
                 <w:szCs w:val="22"/>
                 <w:color w:val="000000"/>
               </w:rPr>
-              <w:t xml:space="preserve">32.6</w:t>
+              <w:t xml:space="preserve">32.64</w:t>
             </w:r>
           </w:p>
         </w:tc>
@@ -802,14 +802,14 @@
                 <w:szCs w:val="22"/>
                 <w:color w:val="000000"/>
               </w:rPr>
-              <w:t xml:space="preserve">1.94%&lt;</w:t>
+              <w:t xml:space="preserve">1.935&lt;</w:t>
             </w:r>
           </w:p>
         </w:tc>
       </w:tr>
       <w:tr>
         <w:trPr>
-          <w:trHeight w:val="638" w:hRule="auto"/>
+          <w:trHeight w:val="632" w:hRule="auto"/>
         </w:trPr>
         <w:tc>
           <w:tcPr>
@@ -917,7 +917,7 @@
                 <w:szCs w:val="22"/>
                 <w:color w:val="000000"/>
               </w:rPr>
-              <w:t xml:space="preserve">4.2</w:t>
+              <w:t xml:space="preserve">4.198</w:t>
             </w:r>
           </w:p>
         </w:tc>
@@ -972,7 +972,7 @@
                 <w:szCs w:val="22"/>
                 <w:color w:val="000000"/>
               </w:rPr>
-              <w:t xml:space="preserve">0.0295</w:t>
+              <w:t xml:space="preserve">0.02952</w:t>
             </w:r>
           </w:p>
         </w:tc>
@@ -1027,7 +1027,7 @@
                 <w:szCs w:val="22"/>
                 <w:color w:val="000000"/>
               </w:rPr>
-              <w:t xml:space="preserve">0.703</w:t>
+              <w:t xml:space="preserve">0.7032</w:t>
             </w:r>
           </w:p>
         </w:tc>
@@ -1082,7 +1082,7 @@
                 <w:szCs w:val="22"/>
                 <w:color w:val="000000"/>
               </w:rPr>
-              <w:t xml:space="preserve">66.6 (62.8, 70.5)</w:t>
+              <w:t xml:space="preserve">66.56 (62.82, 70.53)</w:t>
             </w:r>
           </w:p>
         </w:tc>
@@ -1137,7 +1137,7 @@
                 <w:szCs w:val="22"/>
                 <w:color w:val="000000"/>
               </w:rPr>
-              <w:t xml:space="preserve">32.3</w:t>
+              <w:t xml:space="preserve">32.33</w:t>
             </w:r>
           </w:p>
         </w:tc>
@@ -1192,14 +1192,14 @@
                 <w:szCs w:val="22"/>
                 <w:color w:val="000000"/>
               </w:rPr>
-              <w:t xml:space="preserve">2.46%&lt;</w:t>
+              <w:t xml:space="preserve">2.465&lt;</w:t>
             </w:r>
           </w:p>
         </w:tc>
       </w:tr>
       <w:tr>
         <w:trPr>
-          <w:trHeight w:val="641" w:hRule="auto"/>
+          <w:trHeight w:val="632" w:hRule="auto"/>
         </w:trPr>
         <w:tc>
           <w:tcPr>
@@ -1307,7 +1307,7 @@
                 <w:szCs w:val="22"/>
                 <w:color w:val="000000"/>
               </w:rPr>
-              <w:t xml:space="preserve">1.38</w:t>
+              <w:t xml:space="preserve">1.380</w:t>
             </w:r>
           </w:p>
         </w:tc>
@@ -1362,7 +1362,7 @@
                 <w:szCs w:val="22"/>
                 <w:color w:val="000000"/>
               </w:rPr>
-              <w:t xml:space="preserve">0.0547</w:t>
+              <w:t xml:space="preserve">0.05471</w:t>
             </w:r>
           </w:p>
         </w:tc>
@@ -1417,7 +1417,7 @@
                 <w:szCs w:val="22"/>
                 <w:color w:val="000000"/>
               </w:rPr>
-              <w:t xml:space="preserve">3.96</w:t>
+              <w:t xml:space="preserve">3.965</w:t>
             </w:r>
           </w:p>
         </w:tc>
@@ -1472,7 +1472,7 @@
                 <w:szCs w:val="22"/>
                 <w:color w:val="000000"/>
               </w:rPr>
-              <w:t xml:space="preserve">3.98 (3.57, 4.42)</w:t>
+              <w:t xml:space="preserve">3.975 (3.571, 4.425)</w:t>
             </w:r>
           </w:p>
         </w:tc>
@@ -1527,7 +1527,7 @@
                 <w:szCs w:val="22"/>
                 <w:color w:val="000000"/>
               </w:rPr>
-              <w:t xml:space="preserve">32.7</w:t>
+              <w:t xml:space="preserve">32.65</w:t>
             </w:r>
           </w:p>
         </w:tc>
@@ -1582,14 +1582,14 @@
                 <w:szCs w:val="22"/>
                 <w:color w:val="000000"/>
               </w:rPr>
-              <w:t xml:space="preserve">40.5%&gt;</w:t>
+              <w:t xml:space="preserve">40.50&gt;</w:t>
             </w:r>
           </w:p>
         </w:tc>
       </w:tr>
       <w:tr>
         <w:trPr>
-          <w:trHeight w:val="638" w:hRule="auto"/>
+          <w:trHeight w:val="632" w:hRule="auto"/>
         </w:trPr>
         <w:tc>
           <w:tcPr>
@@ -1697,7 +1697,7 @@
                 <w:szCs w:val="22"/>
                 <w:color w:val="000000"/>
               </w:rPr>
-              <w:t xml:space="preserve">3.88</w:t>
+              <w:t xml:space="preserve">3.877</w:t>
             </w:r>
           </w:p>
         </w:tc>
@@ -1752,7 +1752,7 @@
                 <w:szCs w:val="22"/>
                 <w:color w:val="000000"/>
               </w:rPr>
-              <w:t xml:space="preserve">0.0348</w:t>
+              <w:t xml:space="preserve">0.03483</w:t>
             </w:r>
           </w:p>
         </w:tc>
@@ -1807,7 +1807,7 @@
                 <w:szCs w:val="22"/>
                 <w:color w:val="000000"/>
               </w:rPr>
-              <w:t xml:space="preserve">0.899</w:t>
+              <w:t xml:space="preserve">0.8986</w:t>
             </w:r>
           </w:p>
         </w:tc>
@@ -1862,7 +1862,7 @@
                 <w:szCs w:val="22"/>
                 <w:color w:val="000000"/>
               </w:rPr>
-              <w:t xml:space="preserve">48.3 (45.1, 51.7)</w:t>
+              <w:t xml:space="preserve">48.26 (45.07, 51.67)</w:t>
             </w:r>
           </w:p>
         </w:tc>
@@ -1917,7 +1917,7 @@
                 <w:szCs w:val="22"/>
                 <w:color w:val="000000"/>
               </w:rPr>
-              <w:t xml:space="preserve">27.5</w:t>
+              <w:t xml:space="preserve">27.53</w:t>
             </w:r>
           </w:p>
         </w:tc>
@@ -1972,14 +1972,14 @@
                 <w:szCs w:val="22"/>
                 <w:color w:val="000000"/>
               </w:rPr>
-              <w:t xml:space="preserve">28.4%=</w:t>
+              <w:t xml:space="preserve">28.37=</w:t>
             </w:r>
           </w:p>
         </w:tc>
       </w:tr>
       <w:tr>
         <w:trPr>
-          <w:trHeight w:val="594" w:hRule="auto"/>
+          <w:trHeight w:val="647" w:hRule="auto"/>
         </w:trPr>
         <w:tc>
           <w:tcPr>
@@ -2087,7 +2087,172 @@
                 <w:szCs w:val="22"/>
                 <w:color w:val="000000"/>
               </w:rPr>
-              <w:t xml:space="preserve">0.196</w:t>
+              <w:t xml:space="preserve">0.1964</w:t>
+            </w:r>
+          </w:p>
+        </w:tc>
+        <w:tc>
+          <w:tcPr>
+            <w:tcBorders>
+              <w:bottom w:val="single" w:sz="12" w:space="0" w:color="666666"/>
+              <w:top w:val="none" w:sz="0" w:space="0" w:color="000000"/>
+              <w:left w:val="none" w:sz="0" w:space="0" w:color="000000"/>
+              <w:right w:val="none" w:sz="0" w:space="0" w:color="000000"/>
+            </w:tcBorders>
+            <w:shd w:val="clear" w:color="auto" w:fill="FFFFFF"/>
+            <w:tcMar>
+              <w:top w:w="0" w:type="dxa"/>
+              <w:bottom w:w="0" w:type="dxa"/>
+              <w:left w:w="0" w:type="dxa"/>
+              <w:right w:w="0" w:type="dxa"/>
+            </w:tcMar>
+            <w:vAlign w:val="center"/>
+          </w:tcPr>
+          <w:p>
+            <w:pPr>
+              <w:pStyle w:val="Normal"/>
+              <w:jc w:val="left"/>
+              <w:pBdr>
+                <w:bottom w:val="none" w:sz="0" w:space="0" w:color="000000"/>
+                <w:top w:val="none" w:sz="0" w:space="0" w:color="000000"/>
+                <w:left w:val="none" w:sz="0" w:space="0" w:color="000000"/>
+                <w:right w:val="none" w:sz="0" w:space="0" w:color="000000"/>
+              </w:pBdr>
+              <w:spacing w:after="100" w:before="100" w:line="240"/>
+              <w:ind w:left="100" w:right="100" w:firstLine="0" w:firstLineChars="0"/>
+              <w:rPr>
+                <w:rFonts w:ascii="DejaVu Sans" w:hAnsi="DejaVu Sans" w:eastAsia="DejaVu Sans" w:cs="DejaVu Sans"/>
+                <w:i w:val="false"/>
+                <w:b w:val="false"/>
+                <w:u w:val="none"/>
+                <w:strike w:val="false"/>
+                <w:sz w:val="22"/>
+                <w:szCs w:val="22"/>
+                <w:color w:val="000000"/>
+              </w:rPr>
+            </w:pPr>
+            <w:r>
+              <w:rPr>
+                <w:rFonts w:ascii="DejaVu Sans" w:hAnsi="DejaVu Sans" w:eastAsia="DejaVu Sans" w:cs="DejaVu Sans"/>
+                <w:i w:val="false"/>
+                <w:b w:val="false"/>
+                <w:u w:val="none"/>
+                <w:strike w:val="false"/>
+                <w:sz w:val="22"/>
+                <w:szCs w:val="22"/>
+                <w:color w:val="000000"/>
+              </w:rPr>
+              <w:t xml:space="preserve">0.003153</w:t>
+            </w:r>
+          </w:p>
+        </w:tc>
+        <w:tc>
+          <w:tcPr>
+            <w:tcBorders>
+              <w:bottom w:val="single" w:sz="12" w:space="0" w:color="666666"/>
+              <w:top w:val="none" w:sz="0" w:space="0" w:color="000000"/>
+              <w:left w:val="none" w:sz="0" w:space="0" w:color="000000"/>
+              <w:right w:val="none" w:sz="0" w:space="0" w:color="000000"/>
+            </w:tcBorders>
+            <w:shd w:val="clear" w:color="auto" w:fill="FFFFFF"/>
+            <w:tcMar>
+              <w:top w:w="0" w:type="dxa"/>
+              <w:bottom w:w="0" w:type="dxa"/>
+              <w:left w:w="0" w:type="dxa"/>
+              <w:right w:w="0" w:type="dxa"/>
+            </w:tcMar>
+            <w:vAlign w:val="center"/>
+          </w:tcPr>
+          <w:p>
+            <w:pPr>
+              <w:pStyle w:val="Normal"/>
+              <w:jc w:val="left"/>
+              <w:pBdr>
+                <w:bottom w:val="none" w:sz="0" w:space="0" w:color="000000"/>
+                <w:top w:val="none" w:sz="0" w:space="0" w:color="000000"/>
+                <w:left w:val="none" w:sz="0" w:space="0" w:color="000000"/>
+                <w:right w:val="none" w:sz="0" w:space="0" w:color="000000"/>
+              </w:pBdr>
+              <w:spacing w:after="100" w:before="100" w:line="240"/>
+              <w:ind w:left="100" w:right="100" w:firstLine="0" w:firstLineChars="0"/>
+              <w:rPr>
+                <w:rFonts w:ascii="DejaVu Sans" w:hAnsi="DejaVu Sans" w:eastAsia="DejaVu Sans" w:cs="DejaVu Sans"/>
+                <w:i w:val="false"/>
+                <w:b w:val="false"/>
+                <w:u w:val="none"/>
+                <w:strike w:val="false"/>
+                <w:sz w:val="22"/>
+                <w:szCs w:val="22"/>
+                <w:color w:val="000000"/>
+              </w:rPr>
+            </w:pPr>
+            <w:r>
+              <w:rPr>
+                <w:rFonts w:ascii="DejaVu Sans" w:hAnsi="DejaVu Sans" w:eastAsia="DejaVu Sans" w:cs="DejaVu Sans"/>
+                <w:i w:val="false"/>
+                <w:b w:val="false"/>
+                <w:u w:val="none"/>
+                <w:strike w:val="false"/>
+                <w:sz w:val="22"/>
+                <w:szCs w:val="22"/>
+                <w:color w:val="000000"/>
+              </w:rPr>
+              <w:t xml:space="preserve">1.605</w:t>
+            </w:r>
+          </w:p>
+        </w:tc>
+        <w:tc>
+          <w:tcPr>
+            <w:tcBorders>
+              <w:bottom w:val="single" w:sz="12" w:space="0" w:color="666666"/>
+              <w:top w:val="none" w:sz="0" w:space="0" w:color="000000"/>
+              <w:left w:val="none" w:sz="0" w:space="0" w:color="000000"/>
+              <w:right w:val="none" w:sz="0" w:space="0" w:color="000000"/>
+            </w:tcBorders>
+            <w:shd w:val="clear" w:color="auto" w:fill="FFFFFF"/>
+            <w:tcMar>
+              <w:top w:w="0" w:type="dxa"/>
+              <w:bottom w:w="0" w:type="dxa"/>
+              <w:left w:w="0" w:type="dxa"/>
+              <w:right w:w="0" w:type="dxa"/>
+            </w:tcMar>
+            <w:vAlign w:val="center"/>
+          </w:tcPr>
+          <w:p>
+            <w:pPr>
+              <w:pStyle w:val="Normal"/>
+              <w:jc w:val="left"/>
+              <w:pBdr>
+                <w:bottom w:val="none" w:sz="0" w:space="0" w:color="000000"/>
+                <w:top w:val="none" w:sz="0" w:space="0" w:color="000000"/>
+                <w:left w:val="none" w:sz="0" w:space="0" w:color="000000"/>
+                <w:right w:val="none" w:sz="0" w:space="0" w:color="000000"/>
+              </w:pBdr>
+              <w:spacing w:after="100" w:before="100" w:line="240"/>
+              <w:ind w:left="100" w:right="100" w:firstLine="0" w:firstLineChars="0"/>
+              <w:rPr>
+                <w:rFonts w:ascii="DejaVu Sans" w:hAnsi="DejaVu Sans" w:eastAsia="DejaVu Sans" w:cs="DejaVu Sans"/>
+                <w:i w:val="false"/>
+                <w:b w:val="false"/>
+                <w:u w:val="none"/>
+                <w:strike w:val="false"/>
+                <w:sz w:val="22"/>
+                <w:szCs w:val="22"/>
+                <w:color w:val="000000"/>
+              </w:rPr>
+            </w:pPr>
+            <w:r>
+              <w:rPr>
+                <w:rFonts w:ascii="DejaVu Sans" w:hAnsi="DejaVu Sans" w:eastAsia="DejaVu Sans" w:cs="DejaVu Sans"/>
+                <w:i w:val="false"/>
+                <w:b w:val="false"/>
+                <w:u w:val="none"/>
+                <w:strike w:val="false"/>
+                <w:sz w:val="22"/>
+                <w:szCs w:val="22"/>
+                <w:color w:val="000000"/>
+              </w:rPr>
+              <w:t xml:space="preserve">0.1964 (0.1903, 0.2026)</w:t>
             </w:r>
           </w:p>
         </w:tc>
@@ -2201,171 +2366,6 @@
             </w:r>
           </w:p>
         </w:tc>
-        <w:tc>
-          <w:tcPr>
-            <w:tcBorders>
-              <w:bottom w:val="single" w:sz="12" w:space="0" w:color="666666"/>
-              <w:top w:val="none" w:sz="0" w:space="0" w:color="000000"/>
-              <w:left w:val="none" w:sz="0" w:space="0" w:color="000000"/>
-              <w:right w:val="none" w:sz="0" w:space="0" w:color="000000"/>
-            </w:tcBorders>
-            <w:shd w:val="clear" w:color="auto" w:fill="FFFFFF"/>
-            <w:tcMar>
-              <w:top w:w="0" w:type="dxa"/>
-              <w:bottom w:w="0" w:type="dxa"/>
-              <w:left w:w="0" w:type="dxa"/>
-              <w:right w:w="0" w:type="dxa"/>
-            </w:tcMar>
-            <w:vAlign w:val="center"/>
-          </w:tcPr>
-          <w:p>
-            <w:pPr>
-              <w:pStyle w:val="Normal"/>
-              <w:jc w:val="left"/>
-              <w:pBdr>
-                <w:bottom w:val="none" w:sz="0" w:space="0" w:color="000000"/>
-                <w:top w:val="none" w:sz="0" w:space="0" w:color="000000"/>
-                <w:left w:val="none" w:sz="0" w:space="0" w:color="000000"/>
-                <w:right w:val="none" w:sz="0" w:space="0" w:color="000000"/>
-              </w:pBdr>
-              <w:spacing w:after="100" w:before="100" w:line="240"/>
-              <w:ind w:left="100" w:right="100" w:firstLine="0" w:firstLineChars="0"/>
-              <w:rPr>
-                <w:rFonts w:ascii="DejaVu Sans" w:hAnsi="DejaVu Sans" w:eastAsia="DejaVu Sans" w:cs="DejaVu Sans"/>
-                <w:i w:val="false"/>
-                <w:b w:val="false"/>
-                <w:u w:val="none"/>
-                <w:strike w:val="false"/>
-                <w:sz w:val="22"/>
-                <w:szCs w:val="22"/>
-                <w:color w:val="000000"/>
-              </w:rPr>
-            </w:pPr>
-            <w:r>
-              <w:rPr>
-                <w:rFonts w:ascii="DejaVu Sans" w:hAnsi="DejaVu Sans" w:eastAsia="DejaVu Sans" w:cs="DejaVu Sans"/>
-                <w:i w:val="false"/>
-                <w:b w:val="false"/>
-                <w:u w:val="none"/>
-                <w:strike w:val="false"/>
-                <w:sz w:val="22"/>
-                <w:szCs w:val="22"/>
-                <w:color w:val="000000"/>
-              </w:rPr>
-              <w:t xml:space="preserve">0.196</w:t>
-            </w:r>
-          </w:p>
-        </w:tc>
-        <w:tc>
-          <w:tcPr>
-            <w:tcBorders>
-              <w:bottom w:val="single" w:sz="12" w:space="0" w:color="666666"/>
-              <w:top w:val="none" w:sz="0" w:space="0" w:color="000000"/>
-              <w:left w:val="none" w:sz="0" w:space="0" w:color="000000"/>
-              <w:right w:val="none" w:sz="0" w:space="0" w:color="000000"/>
-            </w:tcBorders>
-            <w:shd w:val="clear" w:color="auto" w:fill="FFFFFF"/>
-            <w:tcMar>
-              <w:top w:w="0" w:type="dxa"/>
-              <w:bottom w:w="0" w:type="dxa"/>
-              <w:left w:w="0" w:type="dxa"/>
-              <w:right w:w="0" w:type="dxa"/>
-            </w:tcMar>
-            <w:vAlign w:val="center"/>
-          </w:tcPr>
-          <w:p>
-            <w:pPr>
-              <w:pStyle w:val="Normal"/>
-              <w:jc w:val="left"/>
-              <w:pBdr>
-                <w:bottom w:val="none" w:sz="0" w:space="0" w:color="000000"/>
-                <w:top w:val="none" w:sz="0" w:space="0" w:color="000000"/>
-                <w:left w:val="none" w:sz="0" w:space="0" w:color="000000"/>
-                <w:right w:val="none" w:sz="0" w:space="0" w:color="000000"/>
-              </w:pBdr>
-              <w:spacing w:after="100" w:before="100" w:line="240"/>
-              <w:ind w:left="100" w:right="100" w:firstLine="0" w:firstLineChars="0"/>
-              <w:rPr>
-                <w:rFonts w:ascii="DejaVu Sans" w:hAnsi="DejaVu Sans" w:eastAsia="DejaVu Sans" w:cs="DejaVu Sans"/>
-                <w:i w:val="false"/>
-                <w:b w:val="false"/>
-                <w:u w:val="none"/>
-                <w:strike w:val="false"/>
-                <w:sz w:val="22"/>
-                <w:szCs w:val="22"/>
-                <w:color w:val="000000"/>
-              </w:rPr>
-            </w:pPr>
-            <w:r>
-              <w:rPr>
-                <w:rFonts w:ascii="DejaVu Sans" w:hAnsi="DejaVu Sans" w:eastAsia="DejaVu Sans" w:cs="DejaVu Sans"/>
-                <w:i w:val="false"/>
-                <w:b w:val="false"/>
-                <w:u w:val="none"/>
-                <w:strike w:val="false"/>
-                <w:sz w:val="22"/>
-                <w:szCs w:val="22"/>
-                <w:color w:val="000000"/>
-              </w:rPr>
-              <w:t xml:space="preserve"> </w:t>
-            </w:r>
-          </w:p>
-        </w:tc>
-        <w:tc>
-          <w:tcPr>
-            <w:tcBorders>
-              <w:bottom w:val="single" w:sz="12" w:space="0" w:color="666666"/>
-              <w:top w:val="none" w:sz="0" w:space="0" w:color="000000"/>
-              <w:left w:val="none" w:sz="0" w:space="0" w:color="000000"/>
-              <w:right w:val="none" w:sz="0" w:space="0" w:color="000000"/>
-            </w:tcBorders>
-            <w:shd w:val="clear" w:color="auto" w:fill="FFFFFF"/>
-            <w:tcMar>
-              <w:top w:w="0" w:type="dxa"/>
-              <w:bottom w:w="0" w:type="dxa"/>
-              <w:left w:w="0" w:type="dxa"/>
-              <w:right w:w="0" w:type="dxa"/>
-            </w:tcMar>
-            <w:vAlign w:val="center"/>
-          </w:tcPr>
-          <w:p>
-            <w:pPr>
-              <w:pStyle w:val="Normal"/>
-              <w:jc w:val="left"/>
-              <w:pBdr>
-                <w:bottom w:val="none" w:sz="0" w:space="0" w:color="000000"/>
-                <w:top w:val="none" w:sz="0" w:space="0" w:color="000000"/>
-                <w:left w:val="none" w:sz="0" w:space="0" w:color="000000"/>
-                <w:right w:val="none" w:sz="0" w:space="0" w:color="000000"/>
-              </w:pBdr>
-              <w:spacing w:after="100" w:before="100" w:line="240"/>
-              <w:ind w:left="100" w:right="100" w:firstLine="0" w:firstLineChars="0"/>
-              <w:rPr>
-                <w:rFonts w:ascii="DejaVu Sans" w:hAnsi="DejaVu Sans" w:eastAsia="DejaVu Sans" w:cs="DejaVu Sans"/>
-                <w:i w:val="false"/>
-                <w:b w:val="false"/>
-                <w:u w:val="none"/>
-                <w:strike w:val="false"/>
-                <w:sz w:val="22"/>
-                <w:szCs w:val="22"/>
-                <w:color w:val="000000"/>
-              </w:rPr>
-            </w:pPr>
-            <w:r>
-              <w:rPr>
-                <w:rFonts w:ascii="DejaVu Sans" w:hAnsi="DejaVu Sans" w:eastAsia="DejaVu Sans" w:cs="DejaVu Sans"/>
-                <w:i w:val="false"/>
-                <w:b w:val="false"/>
-                <w:u w:val="none"/>
-                <w:strike w:val="false"/>
-                <w:sz w:val="22"/>
-                <w:szCs w:val="22"/>
-                <w:color w:val="000000"/>
-              </w:rPr>
-              <w:t xml:space="preserve"> </w:t>
-            </w:r>
-          </w:p>
-        </w:tc>
       </w:tr>
     </w:tbl>
     <w:p>
@@ -2379,7 +2379,7 @@
         </w:rPr>
         <w:t xml:space="preserve">Table </w:t>
       </w:r>
-      <w:bookmarkStart w:id="7de23032-08e1-4832-a4e4-ad8d1dbb174c" w:name="pest_table"/>
+      <w:bookmarkStart w:id="6eef9c9b-b3ec-4b58-914d-46c0653ea0f5" w:name="pest_table"/>
       <w:r>
         <w:rPr/>
         <w:t xml:space="preserve"/>
@@ -2400,7 +2400,7 @@
         <w:rPr/>
         <w:t xml:space="preserve"/>
       </w:r>
-      <w:bookmarkEnd w:id="7de23032-08e1-4832-a4e4-ad8d1dbb174c"/>
+      <w:bookmarkEnd w:id="6eef9c9b-b3ec-4b58-914d-46c0653ea0f5"/>
       <w:r>
         <w:rPr>
           <w:rFonts/>
@@ -2496,7 +2496,7 @@
         </w:rPr>
         <w:t xml:space="preserve">Figure </w:t>
       </w:r>
-      <w:bookmarkStart w:id="b5d12d51-1de8-4958-9ab2-e29e29b0ec77" w:name="ind_plots"/>
+      <w:bookmarkStart w:id="5abcd1d0-539f-451c-b98d-bb7995b4c2c1" w:name="ind_plots"/>
       <w:r>
         <w:rPr/>
         <w:t xml:space="preserve"/>
@@ -2517,7 +2517,7 @@
         <w:rPr/>
         <w:t xml:space="preserve"/>
       </w:r>
-      <w:bookmarkEnd w:id="b5d12d51-1de8-4958-9ab2-e29e29b0ec77"/>
+      <w:bookmarkEnd w:id="5abcd1d0-539f-451c-b98d-bb7995b4c2c1"/>
       <w:r>
         <w:rPr>
           <w:rFonts/>
@@ -3400,7 +3400,7 @@
         </w:rPr>
         <w:t xml:space="preserve">Figure </w:t>
       </w:r>
-      <w:bookmarkStart w:id="dcd23533-c326-4b51-a24f-25c756e1cbb1" w:name="dv_vs_pred_ipred"/>
+      <w:bookmarkStart w:id="e61d1852-7241-4f5d-b4db-4804d696d947" w:name="dv_vs_pred_ipred"/>
       <w:r>
         <w:rPr/>
         <w:t xml:space="preserve"/>
@@ -3421,7 +3421,7 @@
         <w:rPr/>
         <w:t xml:space="preserve"/>
       </w:r>
-      <w:bookmarkEnd w:id="dcd23533-c326-4b51-a24f-25c756e1cbb1"/>
+      <w:bookmarkEnd w:id="e61d1852-7241-4f5d-b4db-4804d696d947"/>
       <w:r>
         <w:rPr>
           <w:rFonts/>
@@ -3509,7 +3509,7 @@
         </w:rPr>
         <w:t xml:space="preserve">Figure </w:t>
       </w:r>
-      <w:bookmarkStart w:id="11c7d196-68d4-436b-93de-4541094f694e" w:name="prm_vs_iteration"/>
+      <w:bookmarkStart w:id="cb56c350-475c-49f7-ab96-3331aba32b8e" w:name="prm_vs_iteration"/>
       <w:r>
         <w:rPr/>
         <w:t xml:space="preserve"/>
@@ -3530,7 +3530,7 @@
         <w:rPr/>
         <w:t xml:space="preserve"/>
       </w:r>
-      <w:bookmarkEnd w:id="11c7d196-68d4-436b-93de-4541094f694e"/>
+      <w:bookmarkEnd w:id="cb56c350-475c-49f7-ab96-3331aba32b8e"/>
       <w:r>
         <w:rPr>
           <w:rFonts/>

</xml_diff>

<commit_message>
Deploying to gh-pages from @ nlmixr2/nonmem2rx@148faf8772ee64539e65b943306d60534275240b 🚀
</commit_message>
<xml_diff>
--- a/articles/mod-Word.docx
+++ b/articles/mod-Word.docx
@@ -19,9 +19,9 @@
       </w:tblPr>
       <w:tblGrid>
         <w:gridCol w:w="1565"/>
-        <w:gridCol w:w="1180"/>
-        <w:gridCol w:w="1460"/>
-        <w:gridCol w:w="1180"/>
+        <w:gridCol w:w="1040"/>
+        <w:gridCol w:w="1320"/>
+        <w:gridCol w:w="1051"/>
         <w:gridCol w:w="3261"/>
         <w:gridCol w:w="1537"/>
         <w:gridCol w:w="1798"/>
@@ -527,7 +527,7 @@
                 <w:szCs w:val="22"/>
                 <w:color w:val="000000"/>
               </w:rPr>
-              <w:t xml:space="preserve">1.370</w:t>
+              <w:t xml:space="preserve">1.37</w:t>
             </w:r>
           </w:p>
         </w:tc>
@@ -582,7 +582,7 @@
                 <w:szCs w:val="22"/>
                 <w:color w:val="000000"/>
               </w:rPr>
-              <w:t xml:space="preserve">0.02979</w:t>
+              <w:t xml:space="preserve">0.0298</w:t>
             </w:r>
           </w:p>
         </w:tc>
@@ -637,7 +637,7 @@
                 <w:szCs w:val="22"/>
                 <w:color w:val="000000"/>
               </w:rPr>
-              <w:t xml:space="preserve">2.174</w:t>
+              <w:t xml:space="preserve">2.17</w:t>
             </w:r>
           </w:p>
         </w:tc>
@@ -692,7 +692,7 @@
                 <w:szCs w:val="22"/>
                 <w:color w:val="000000"/>
               </w:rPr>
-              <w:t xml:space="preserve">3.937 (3.713, 4.173)</w:t>
+              <w:t xml:space="preserve">3.94 (3.71, 4.17)</w:t>
             </w:r>
           </w:p>
         </w:tc>
@@ -747,7 +747,7 @@
                 <w:szCs w:val="22"/>
                 <w:color w:val="000000"/>
               </w:rPr>
-              <w:t xml:space="preserve">32.64</w:t>
+              <w:t xml:space="preserve">32.6</w:t>
             </w:r>
           </w:p>
         </w:tc>
@@ -802,7 +802,7 @@
                 <w:szCs w:val="22"/>
                 <w:color w:val="000000"/>
               </w:rPr>
-              <w:t xml:space="preserve">1.935&lt;</w:t>
+              <w:t xml:space="preserve">1.94&lt;</w:t>
             </w:r>
           </w:p>
         </w:tc>
@@ -917,7 +917,7 @@
                 <w:szCs w:val="22"/>
                 <w:color w:val="000000"/>
               </w:rPr>
-              <w:t xml:space="preserve">4.198</w:t>
+              <w:t xml:space="preserve">4.20</w:t>
             </w:r>
           </w:p>
         </w:tc>
@@ -972,7 +972,7 @@
                 <w:szCs w:val="22"/>
                 <w:color w:val="000000"/>
               </w:rPr>
-              <w:t xml:space="preserve">0.02952</w:t>
+              <w:t xml:space="preserve">0.0295</w:t>
             </w:r>
           </w:p>
         </w:tc>
@@ -1027,7 +1027,7 @@
                 <w:szCs w:val="22"/>
                 <w:color w:val="000000"/>
               </w:rPr>
-              <w:t xml:space="preserve">0.7032</w:t>
+              <w:t xml:space="preserve">0.703</w:t>
             </w:r>
           </w:p>
         </w:tc>
@@ -1082,7 +1082,7 @@
                 <w:szCs w:val="22"/>
                 <w:color w:val="000000"/>
               </w:rPr>
-              <w:t xml:space="preserve">66.56 (62.82, 70.53)</w:t>
+              <w:t xml:space="preserve">66.6 (62.8, 70.5)</w:t>
             </w:r>
           </w:p>
         </w:tc>
@@ -1137,7 +1137,7 @@
                 <w:szCs w:val="22"/>
                 <w:color w:val="000000"/>
               </w:rPr>
-              <w:t xml:space="preserve">32.33</w:t>
+              <w:t xml:space="preserve">32.3</w:t>
             </w:r>
           </w:p>
         </w:tc>
@@ -1192,7 +1192,7 @@
                 <w:szCs w:val="22"/>
                 <w:color w:val="000000"/>
               </w:rPr>
-              <w:t xml:space="preserve">2.465&lt;</w:t>
+              <w:t xml:space="preserve">2.46&lt;</w:t>
             </w:r>
           </w:p>
         </w:tc>
@@ -1307,7 +1307,7 @@
                 <w:szCs w:val="22"/>
                 <w:color w:val="000000"/>
               </w:rPr>
-              <w:t xml:space="preserve">1.380</w:t>
+              <w:t xml:space="preserve">1.38</w:t>
             </w:r>
           </w:p>
         </w:tc>
@@ -1362,7 +1362,7 @@
                 <w:szCs w:val="22"/>
                 <w:color w:val="000000"/>
               </w:rPr>
-              <w:t xml:space="preserve">0.05471</w:t>
+              <w:t xml:space="preserve">0.0547</w:t>
             </w:r>
           </w:p>
         </w:tc>
@@ -1417,7 +1417,7 @@
                 <w:szCs w:val="22"/>
                 <w:color w:val="000000"/>
               </w:rPr>
-              <w:t xml:space="preserve">3.965</w:t>
+              <w:t xml:space="preserve">3.96</w:t>
             </w:r>
           </w:p>
         </w:tc>
@@ -1472,7 +1472,7 @@
                 <w:szCs w:val="22"/>
                 <w:color w:val="000000"/>
               </w:rPr>
-              <w:t xml:space="preserve">3.975 (3.571, 4.425)</w:t>
+              <w:t xml:space="preserve">3.98 (3.57, 4.42)</w:t>
             </w:r>
           </w:p>
         </w:tc>
@@ -1527,7 +1527,7 @@
                 <w:szCs w:val="22"/>
                 <w:color w:val="000000"/>
               </w:rPr>
-              <w:t xml:space="preserve">32.65</w:t>
+              <w:t xml:space="preserve">32.7</w:t>
             </w:r>
           </w:p>
         </w:tc>
@@ -1582,7 +1582,7 @@
                 <w:szCs w:val="22"/>
                 <w:color w:val="000000"/>
               </w:rPr>
-              <w:t xml:space="preserve">40.50&gt;</w:t>
+              <w:t xml:space="preserve">40.5&gt;</w:t>
             </w:r>
           </w:p>
         </w:tc>
@@ -1697,7 +1697,7 @@
                 <w:szCs w:val="22"/>
                 <w:color w:val="000000"/>
               </w:rPr>
-              <w:t xml:space="preserve">3.877</w:t>
+              <w:t xml:space="preserve">3.88</w:t>
             </w:r>
           </w:p>
         </w:tc>
@@ -1752,7 +1752,7 @@
                 <w:szCs w:val="22"/>
                 <w:color w:val="000000"/>
               </w:rPr>
-              <w:t xml:space="preserve">0.03483</w:t>
+              <w:t xml:space="preserve">0.0348</w:t>
             </w:r>
           </w:p>
         </w:tc>
@@ -1807,7 +1807,7 @@
                 <w:szCs w:val="22"/>
                 <w:color w:val="000000"/>
               </w:rPr>
-              <w:t xml:space="preserve">0.8986</w:t>
+              <w:t xml:space="preserve">0.899</w:t>
             </w:r>
           </w:p>
         </w:tc>
@@ -1862,7 +1862,7 @@
                 <w:szCs w:val="22"/>
                 <w:color w:val="000000"/>
               </w:rPr>
-              <w:t xml:space="preserve">48.26 (45.07, 51.67)</w:t>
+              <w:t xml:space="preserve">48.3 (45.1, 51.7)</w:t>
             </w:r>
           </w:p>
         </w:tc>
@@ -1917,7 +1917,7 @@
                 <w:szCs w:val="22"/>
                 <w:color w:val="000000"/>
               </w:rPr>
-              <w:t xml:space="preserve">27.53</w:t>
+              <w:t xml:space="preserve">27.5</w:t>
             </w:r>
           </w:p>
         </w:tc>
@@ -1972,7 +1972,7 @@
                 <w:szCs w:val="22"/>
                 <w:color w:val="000000"/>
               </w:rPr>
-              <w:t xml:space="preserve">28.37=</w:t>
+              <w:t xml:space="preserve">28.4=</w:t>
             </w:r>
           </w:p>
         </w:tc>
@@ -2087,7 +2087,7 @@
                 <w:szCs w:val="22"/>
                 <w:color w:val="000000"/>
               </w:rPr>
-              <w:t xml:space="preserve">0.1964</w:t>
+              <w:t xml:space="preserve">0.196</w:t>
             </w:r>
           </w:p>
         </w:tc>
@@ -2142,7 +2142,7 @@
                 <w:szCs w:val="22"/>
                 <w:color w:val="000000"/>
               </w:rPr>
-              <w:t xml:space="preserve">0.003153</w:t>
+              <w:t xml:space="preserve">0.00315</w:t>
             </w:r>
           </w:p>
         </w:tc>
@@ -2197,7 +2197,7 @@
                 <w:szCs w:val="22"/>
                 <w:color w:val="000000"/>
               </w:rPr>
-              <w:t xml:space="preserve">1.605</w:t>
+              <w:t xml:space="preserve">1.61</w:t>
             </w:r>
           </w:p>
         </w:tc>
@@ -2252,7 +2252,7 @@
                 <w:szCs w:val="22"/>
                 <w:color w:val="000000"/>
               </w:rPr>
-              <w:t xml:space="preserve">0.1964 (0.1903, 0.2026)</w:t>
+              <w:t xml:space="preserve">0.196 (0.190, 0.203)</w:t>
             </w:r>
           </w:p>
         </w:tc>
@@ -2379,7 +2379,7 @@
         </w:rPr>
         <w:t xml:space="preserve">Table </w:t>
       </w:r>
-      <w:bookmarkStart w:id="6eef9c9b-b3ec-4b58-914d-46c0653ea0f5" w:name="pest_table"/>
+      <w:bookmarkStart w:id="c0bec63f-9648-458a-9a48-bff54d0a75eb" w:name="pest_table"/>
       <w:r>
         <w:rPr/>
         <w:t xml:space="preserve"/>
@@ -2400,7 +2400,7 @@
         <w:rPr/>
         <w:t xml:space="preserve"/>
       </w:r>
-      <w:bookmarkEnd w:id="6eef9c9b-b3ec-4b58-914d-46c0653ea0f5"/>
+      <w:bookmarkEnd w:id="c0bec63f-9648-458a-9a48-bff54d0a75eb"/>
       <w:r>
         <w:rPr>
           <w:rFonts/>
@@ -2496,7 +2496,7 @@
         </w:rPr>
         <w:t xml:space="preserve">Figure </w:t>
       </w:r>
-      <w:bookmarkStart w:id="5abcd1d0-539f-451c-b98d-bb7995b4c2c1" w:name="ind_plots"/>
+      <w:bookmarkStart w:id="6e0726f4-1c63-4ce9-8c3b-c0df4e4149c1" w:name="ind_plots"/>
       <w:r>
         <w:rPr/>
         <w:t xml:space="preserve"/>
@@ -2517,7 +2517,7 @@
         <w:rPr/>
         <w:t xml:space="preserve"/>
       </w:r>
-      <w:bookmarkEnd w:id="5abcd1d0-539f-451c-b98d-bb7995b4c2c1"/>
+      <w:bookmarkEnd w:id="6e0726f4-1c63-4ce9-8c3b-c0df4e4149c1"/>
       <w:r>
         <w:rPr>
           <w:rFonts/>
@@ -3400,7 +3400,7 @@
         </w:rPr>
         <w:t xml:space="preserve">Figure </w:t>
       </w:r>
-      <w:bookmarkStart w:id="e61d1852-7241-4f5d-b4db-4804d696d947" w:name="dv_vs_pred_ipred"/>
+      <w:bookmarkStart w:id="41b5f0bc-cf0e-49d9-8d1c-2b31fdd278a6" w:name="dv_vs_pred_ipred"/>
       <w:r>
         <w:rPr/>
         <w:t xml:space="preserve"/>
@@ -3421,7 +3421,7 @@
         <w:rPr/>
         <w:t xml:space="preserve"/>
       </w:r>
-      <w:bookmarkEnd w:id="e61d1852-7241-4f5d-b4db-4804d696d947"/>
+      <w:bookmarkEnd w:id="41b5f0bc-cf0e-49d9-8d1c-2b31fdd278a6"/>
       <w:r>
         <w:rPr>
           <w:rFonts/>
@@ -3509,7 +3509,7 @@
         </w:rPr>
         <w:t xml:space="preserve">Figure </w:t>
       </w:r>
-      <w:bookmarkStart w:id="cb56c350-475c-49f7-ab96-3331aba32b8e" w:name="prm_vs_iteration"/>
+      <w:bookmarkStart w:id="fdf9384f-b99d-4d69-a8f7-9674094b76c7" w:name="prm_vs_iteration"/>
       <w:r>
         <w:rPr/>
         <w:t xml:space="preserve"/>
@@ -3530,7 +3530,7 @@
         <w:rPr/>
         <w:t xml:space="preserve"/>
       </w:r>
-      <w:bookmarkEnd w:id="cb56c350-475c-49f7-ab96-3331aba32b8e"/>
+      <w:bookmarkEnd w:id="fdf9384f-b99d-4d69-a8f7-9674094b76c7"/>
       <w:r>
         <w:rPr>
           <w:rFonts/>

</xml_diff>

<commit_message>
Deploying to gh-pages from @ nlmixr2/nonmem2rx@0a8ea866b9cb6442ed7109ea011c3ed551f6b22f 🚀
</commit_message>
<xml_diff>
--- a/articles/mod-Word.docx
+++ b/articles/mod-Word.docx
@@ -2379,7 +2379,7 @@
         </w:rPr>
         <w:t xml:space="preserve">Table </w:t>
       </w:r>
-      <w:bookmarkStart w:id="c0bec63f-9648-458a-9a48-bff54d0a75eb" w:name="pest_table"/>
+      <w:bookmarkStart w:id="3d266e07-b2a9-44ea-a4a3-5a4a67c836ef" w:name="pest_table"/>
       <w:r>
         <w:rPr/>
         <w:t xml:space="preserve"/>
@@ -2400,7 +2400,7 @@
         <w:rPr/>
         <w:t xml:space="preserve"/>
       </w:r>
-      <w:bookmarkEnd w:id="c0bec63f-9648-458a-9a48-bff54d0a75eb"/>
+      <w:bookmarkEnd w:id="3d266e07-b2a9-44ea-a4a3-5a4a67c836ef"/>
       <w:r>
         <w:rPr>
           <w:rFonts/>
@@ -2496,7 +2496,7 @@
         </w:rPr>
         <w:t xml:space="preserve">Figure </w:t>
       </w:r>
-      <w:bookmarkStart w:id="6e0726f4-1c63-4ce9-8c3b-c0df4e4149c1" w:name="ind_plots"/>
+      <w:bookmarkStart w:id="dea5063a-967f-4441-9508-ba986bf320c2" w:name="ind_plots"/>
       <w:r>
         <w:rPr/>
         <w:t xml:space="preserve"/>
@@ -2517,7 +2517,7 @@
         <w:rPr/>
         <w:t xml:space="preserve"/>
       </w:r>
-      <w:bookmarkEnd w:id="6e0726f4-1c63-4ce9-8c3b-c0df4e4149c1"/>
+      <w:bookmarkEnd w:id="dea5063a-967f-4441-9508-ba986bf320c2"/>
       <w:r>
         <w:rPr>
           <w:rFonts/>
@@ -3400,7 +3400,7 @@
         </w:rPr>
         <w:t xml:space="preserve">Figure </w:t>
       </w:r>
-      <w:bookmarkStart w:id="41b5f0bc-cf0e-49d9-8d1c-2b31fdd278a6" w:name="dv_vs_pred_ipred"/>
+      <w:bookmarkStart w:id="c152e4ab-2855-406b-b964-37820fe1ea1f" w:name="dv_vs_pred_ipred"/>
       <w:r>
         <w:rPr/>
         <w:t xml:space="preserve"/>
@@ -3421,7 +3421,7 @@
         <w:rPr/>
         <w:t xml:space="preserve"/>
       </w:r>
-      <w:bookmarkEnd w:id="41b5f0bc-cf0e-49d9-8d1c-2b31fdd278a6"/>
+      <w:bookmarkEnd w:id="c152e4ab-2855-406b-b964-37820fe1ea1f"/>
       <w:r>
         <w:rPr>
           <w:rFonts/>
@@ -3509,7 +3509,7 @@
         </w:rPr>
         <w:t xml:space="preserve">Figure </w:t>
       </w:r>
-      <w:bookmarkStart w:id="fdf9384f-b99d-4d69-a8f7-9674094b76c7" w:name="prm_vs_iteration"/>
+      <w:bookmarkStart w:id="cbb342b7-f35c-47f3-b5df-30bf5ce94344" w:name="prm_vs_iteration"/>
       <w:r>
         <w:rPr/>
         <w:t xml:space="preserve"/>
@@ -3530,7 +3530,7 @@
         <w:rPr/>
         <w:t xml:space="preserve"/>
       </w:r>
-      <w:bookmarkEnd w:id="fdf9384f-b99d-4d69-a8f7-9674094b76c7"/>
+      <w:bookmarkEnd w:id="cbb342b7-f35c-47f3-b5df-30bf5ce94344"/>
       <w:r>
         <w:rPr>
           <w:rFonts/>

</xml_diff>

<commit_message>
Deploying to gh-pages from @ nlmixr2/nonmem2rx@492f62b66d0cf5a4333a718321cd889f94cc5294 🚀
</commit_message>
<xml_diff>
--- a/articles/mod-Word.docx
+++ b/articles/mod-Word.docx
@@ -2379,7 +2379,7 @@
         </w:rPr>
         <w:t xml:space="preserve">Table </w:t>
       </w:r>
-      <w:bookmarkStart w:id="3d266e07-b2a9-44ea-a4a3-5a4a67c836ef" w:name="pest_table"/>
+      <w:bookmarkStart w:id="33bdae32-0f32-4f7f-84e8-774dc5963c37" w:name="pest_table"/>
       <w:r>
         <w:rPr/>
         <w:t xml:space="preserve"/>
@@ -2400,7 +2400,7 @@
         <w:rPr/>
         <w:t xml:space="preserve"/>
       </w:r>
-      <w:bookmarkEnd w:id="3d266e07-b2a9-44ea-a4a3-5a4a67c836ef"/>
+      <w:bookmarkEnd w:id="33bdae32-0f32-4f7f-84e8-774dc5963c37"/>
       <w:r>
         <w:rPr>
           <w:rFonts/>
@@ -2496,7 +2496,7 @@
         </w:rPr>
         <w:t xml:space="preserve">Figure </w:t>
       </w:r>
-      <w:bookmarkStart w:id="dea5063a-967f-4441-9508-ba986bf320c2" w:name="ind_plots"/>
+      <w:bookmarkStart w:id="436efadd-8083-488a-a301-be79e3f1968b" w:name="ind_plots"/>
       <w:r>
         <w:rPr/>
         <w:t xml:space="preserve"/>
@@ -2517,7 +2517,7 @@
         <w:rPr/>
         <w:t xml:space="preserve"/>
       </w:r>
-      <w:bookmarkEnd w:id="dea5063a-967f-4441-9508-ba986bf320c2"/>
+      <w:bookmarkEnd w:id="436efadd-8083-488a-a301-be79e3f1968b"/>
       <w:r>
         <w:rPr>
           <w:rFonts/>
@@ -3400,7 +3400,7 @@
         </w:rPr>
         <w:t xml:space="preserve">Figure </w:t>
       </w:r>
-      <w:bookmarkStart w:id="c152e4ab-2855-406b-b964-37820fe1ea1f" w:name="dv_vs_pred_ipred"/>
+      <w:bookmarkStart w:id="ba3ab78b-544d-4843-a653-6d23dff1168a" w:name="dv_vs_pred_ipred"/>
       <w:r>
         <w:rPr/>
         <w:t xml:space="preserve"/>
@@ -3421,7 +3421,7 @@
         <w:rPr/>
         <w:t xml:space="preserve"/>
       </w:r>
-      <w:bookmarkEnd w:id="c152e4ab-2855-406b-b964-37820fe1ea1f"/>
+      <w:bookmarkEnd w:id="ba3ab78b-544d-4843-a653-6d23dff1168a"/>
       <w:r>
         <w:rPr>
           <w:rFonts/>
@@ -3509,7 +3509,7 @@
         </w:rPr>
         <w:t xml:space="preserve">Figure </w:t>
       </w:r>
-      <w:bookmarkStart w:id="cbb342b7-f35c-47f3-b5df-30bf5ce94344" w:name="prm_vs_iteration"/>
+      <w:bookmarkStart w:id="7e8ef7e7-35ac-4a25-8ef7-c23ee1363d39" w:name="prm_vs_iteration"/>
       <w:r>
         <w:rPr/>
         <w:t xml:space="preserve"/>
@@ -3530,7 +3530,7 @@
         <w:rPr/>
         <w:t xml:space="preserve"/>
       </w:r>
-      <w:bookmarkEnd w:id="cbb342b7-f35c-47f3-b5df-30bf5ce94344"/>
+      <w:bookmarkEnd w:id="7e8ef7e7-35ac-4a25-8ef7-c23ee1363d39"/>
       <w:r>
         <w:rPr>
           <w:rFonts/>

</xml_diff>

<commit_message>
Deploying to gh-pages from @ nlmixr2/nonmem2rx@de08fd1446f4776c577cd35aff24102503b1cec6 🚀
</commit_message>
<xml_diff>
--- a/articles/mod-Word.docx
+++ b/articles/mod-Word.docx
@@ -2379,7 +2379,7 @@
         </w:rPr>
         <w:t xml:space="preserve">Table </w:t>
       </w:r>
-      <w:bookmarkStart w:id="33bdae32-0f32-4f7f-84e8-774dc5963c37" w:name="pest_table"/>
+      <w:bookmarkStart w:id="0aeaa6fa-5778-42b6-84d8-b8a0eb31981a" w:name="pest_table"/>
       <w:r>
         <w:rPr/>
         <w:t xml:space="preserve"/>
@@ -2400,7 +2400,7 @@
         <w:rPr/>
         <w:t xml:space="preserve"/>
       </w:r>
-      <w:bookmarkEnd w:id="33bdae32-0f32-4f7f-84e8-774dc5963c37"/>
+      <w:bookmarkEnd w:id="0aeaa6fa-5778-42b6-84d8-b8a0eb31981a"/>
       <w:r>
         <w:rPr>
           <w:rFonts/>
@@ -2496,7 +2496,7 @@
         </w:rPr>
         <w:t xml:space="preserve">Figure </w:t>
       </w:r>
-      <w:bookmarkStart w:id="436efadd-8083-488a-a301-be79e3f1968b" w:name="ind_plots"/>
+      <w:bookmarkStart w:id="9911c97f-9100-4b31-8062-ffcb472a6bf8" w:name="ind_plots"/>
       <w:r>
         <w:rPr/>
         <w:t xml:space="preserve"/>
@@ -2517,7 +2517,7 @@
         <w:rPr/>
         <w:t xml:space="preserve"/>
       </w:r>
-      <w:bookmarkEnd w:id="436efadd-8083-488a-a301-be79e3f1968b"/>
+      <w:bookmarkEnd w:id="9911c97f-9100-4b31-8062-ffcb472a6bf8"/>
       <w:r>
         <w:rPr>
           <w:rFonts/>
@@ -3400,7 +3400,7 @@
         </w:rPr>
         <w:t xml:space="preserve">Figure </w:t>
       </w:r>
-      <w:bookmarkStart w:id="ba3ab78b-544d-4843-a653-6d23dff1168a" w:name="dv_vs_pred_ipred"/>
+      <w:bookmarkStart w:id="bc161eb3-209a-4f65-981f-7dd4bd69c2c9" w:name="dv_vs_pred_ipred"/>
       <w:r>
         <w:rPr/>
         <w:t xml:space="preserve"/>
@@ -3421,7 +3421,7 @@
         <w:rPr/>
         <w:t xml:space="preserve"/>
       </w:r>
-      <w:bookmarkEnd w:id="ba3ab78b-544d-4843-a653-6d23dff1168a"/>
+      <w:bookmarkEnd w:id="bc161eb3-209a-4f65-981f-7dd4bd69c2c9"/>
       <w:r>
         <w:rPr>
           <w:rFonts/>
@@ -3509,7 +3509,7 @@
         </w:rPr>
         <w:t xml:space="preserve">Figure </w:t>
       </w:r>
-      <w:bookmarkStart w:id="7e8ef7e7-35ac-4a25-8ef7-c23ee1363d39" w:name="prm_vs_iteration"/>
+      <w:bookmarkStart w:id="0702f8e8-1d4a-4a6f-8022-f8a0f9777e82" w:name="prm_vs_iteration"/>
       <w:r>
         <w:rPr/>
         <w:t xml:space="preserve"/>
@@ -3530,7 +3530,7 @@
         <w:rPr/>
         <w:t xml:space="preserve"/>
       </w:r>
-      <w:bookmarkEnd w:id="7e8ef7e7-35ac-4a25-8ef7-c23ee1363d39"/>
+      <w:bookmarkEnd w:id="0702f8e8-1d4a-4a6f-8022-f8a0f9777e82"/>
       <w:r>
         <w:rPr>
           <w:rFonts/>

</xml_diff>

<commit_message>
Deploying to gh-pages from @ nlmixr2/nonmem2rx@7ef57844c31297e51f961ceb6d97142d187139f7 🚀
</commit_message>
<xml_diff>
--- a/articles/mod-Word.docx
+++ b/articles/mod-Word.docx
@@ -2379,7 +2379,7 @@
         </w:rPr>
         <w:t xml:space="preserve">Table </w:t>
       </w:r>
-      <w:bookmarkStart w:id="0aeaa6fa-5778-42b6-84d8-b8a0eb31981a" w:name="pest_table"/>
+      <w:bookmarkStart w:id="fc581c7d-fd4f-464f-9139-58361e057da2" w:name="pest_table"/>
       <w:r>
         <w:rPr/>
         <w:t xml:space="preserve"/>
@@ -2400,7 +2400,7 @@
         <w:rPr/>
         <w:t xml:space="preserve"/>
       </w:r>
-      <w:bookmarkEnd w:id="0aeaa6fa-5778-42b6-84d8-b8a0eb31981a"/>
+      <w:bookmarkEnd w:id="fc581c7d-fd4f-464f-9139-58361e057da2"/>
       <w:r>
         <w:rPr>
           <w:rFonts/>
@@ -2496,7 +2496,7 @@
         </w:rPr>
         <w:t xml:space="preserve">Figure </w:t>
       </w:r>
-      <w:bookmarkStart w:id="9911c97f-9100-4b31-8062-ffcb472a6bf8" w:name="ind_plots"/>
+      <w:bookmarkStart w:id="5814f0ac-892c-4040-9b21-84a7cda314b3" w:name="ind_plots"/>
       <w:r>
         <w:rPr/>
         <w:t xml:space="preserve"/>
@@ -2517,7 +2517,7 @@
         <w:rPr/>
         <w:t xml:space="preserve"/>
       </w:r>
-      <w:bookmarkEnd w:id="9911c97f-9100-4b31-8062-ffcb472a6bf8"/>
+      <w:bookmarkEnd w:id="5814f0ac-892c-4040-9b21-84a7cda314b3"/>
       <w:r>
         <w:rPr>
           <w:rFonts/>
@@ -3400,7 +3400,7 @@
         </w:rPr>
         <w:t xml:space="preserve">Figure </w:t>
       </w:r>
-      <w:bookmarkStart w:id="bc161eb3-209a-4f65-981f-7dd4bd69c2c9" w:name="dv_vs_pred_ipred"/>
+      <w:bookmarkStart w:id="52887920-61e6-4fbc-932a-2bdf99d8e936" w:name="dv_vs_pred_ipred"/>
       <w:r>
         <w:rPr/>
         <w:t xml:space="preserve"/>
@@ -3421,7 +3421,7 @@
         <w:rPr/>
         <w:t xml:space="preserve"/>
       </w:r>
-      <w:bookmarkEnd w:id="bc161eb3-209a-4f65-981f-7dd4bd69c2c9"/>
+      <w:bookmarkEnd w:id="52887920-61e6-4fbc-932a-2bdf99d8e936"/>
       <w:r>
         <w:rPr>
           <w:rFonts/>
@@ -3509,7 +3509,7 @@
         </w:rPr>
         <w:t xml:space="preserve">Figure </w:t>
       </w:r>
-      <w:bookmarkStart w:id="0702f8e8-1d4a-4a6f-8022-f8a0f9777e82" w:name="prm_vs_iteration"/>
+      <w:bookmarkStart w:id="15f04b98-ea3f-47c7-ad1c-9a76c96fca1c" w:name="prm_vs_iteration"/>
       <w:r>
         <w:rPr/>
         <w:t xml:space="preserve"/>
@@ -3530,7 +3530,7 @@
         <w:rPr/>
         <w:t xml:space="preserve"/>
       </w:r>
-      <w:bookmarkEnd w:id="0702f8e8-1d4a-4a6f-8022-f8a0f9777e82"/>
+      <w:bookmarkEnd w:id="15f04b98-ea3f-47c7-ad1c-9a76c96fca1c"/>
       <w:r>
         <w:rPr>
           <w:rFonts/>

</xml_diff>